<commit_message>
Update images to use actual UML diagrams
</commit_message>
<xml_diff>
--- a/Jurnal_Lengkap_Dengan_Gambar.docx
+++ b/Jurnal_Lengkap_Dengan_Gambar.docx
@@ -306,7 +306,7 @@
       <w:r>
         <w:drawing>
           <wp:inline distT="0" distB="0" distL="0" distR="0">
-            <wp:extent cx="2667000" cy="1905000"/>
+            <wp:extent cx="2667000" cy="3810000"/>
             <wp:effectExtent t="0" r="0" b="0" l="0"/>
             <wp:docPr id="1" name="" descr="" title=""/>
             <wp:cNvGraphicFramePr>
@@ -331,7 +331,7 @@
                   <pic:spPr bwMode="auto">
                     <a:xfrm>
                       <a:off x="0" y="0"/>
-                      <a:ext cx="2667000" cy="1905000"/>
+                      <a:ext cx="2667000" cy="3810000"/>
                     </a:xfrm>
                     <a:prstGeom prst="rect">
                       <a:avLst/>
@@ -356,7 +356,7 @@
           <w:sz w:val="18"/>
           <w:szCs w:val="18"/>
         </w:rPr>
-        <w:t xml:space="preserve">Gambar 1. Activity Diagram</w:t>
+        <w:t xml:space="preserve">Gambar 1. Activity Diagram (Flowchart Login)</w:t>
       </w:r>
     </w:p>
     <w:p>
@@ -392,7 +392,7 @@
       <w:r>
         <w:drawing>
           <wp:inline distT="0" distB="0" distL="0" distR="0">
-            <wp:extent cx="2667000" cy="2381250"/>
+            <wp:extent cx="2857500" cy="2381250"/>
             <wp:effectExtent t="0" r="0" b="0" l="0"/>
             <wp:docPr id="1" name="" descr="" title=""/>
             <wp:cNvGraphicFramePr>
@@ -417,7 +417,7 @@
                   <pic:spPr bwMode="auto">
                     <a:xfrm>
                       <a:off x="0" y="0"/>
-                      <a:ext cx="2667000" cy="2381250"/>
+                      <a:ext cx="2857500" cy="2381250"/>
                     </a:xfrm>
                     <a:prstGeom prst="rect">
                       <a:avLst/>
@@ -442,7 +442,7 @@
           <w:sz w:val="18"/>
           <w:szCs w:val="18"/>
         </w:rPr>
-        <w:t xml:space="preserve">Gambar 2. Sequence Diagram</w:t>
+        <w:t xml:space="preserve">Gambar 2. Sequence Diagram Login</w:t>
       </w:r>
     </w:p>
     <w:p>
@@ -469,7 +469,7 @@
       <w:r>
         <w:drawing>
           <wp:inline distT="0" distB="0" distL="0" distR="0">
-            <wp:extent cx="2667000" cy="1524000"/>
+            <wp:extent cx="2857500" cy="1524000"/>
             <wp:effectExtent t="0" r="0" b="0" l="0"/>
             <wp:docPr id="1" name="" descr="" title=""/>
             <wp:cNvGraphicFramePr>
@@ -494,7 +494,7 @@
                   <pic:spPr bwMode="auto">
                     <a:xfrm>
                       <a:off x="0" y="0"/>
-                      <a:ext cx="2667000" cy="1524000"/>
+                      <a:ext cx="2857500" cy="1524000"/>
                     </a:xfrm>
                     <a:prstGeom prst="rect">
                       <a:avLst/>
@@ -519,7 +519,7 @@
           <w:sz w:val="18"/>
           <w:szCs w:val="18"/>
         </w:rPr>
-        <w:t xml:space="preserve">Gambar 3. Antarmuka Sistem</w:t>
+        <w:t xml:space="preserve">Gambar 3. Antarmuka Sistem (Halaman Beranda)</w:t>
       </w:r>
     </w:p>
     <w:p>

</xml_diff>

<commit_message>
Format headers like Ammar Maruf
</commit_message>
<xml_diff>
--- a/Jurnal_Lengkap_Dengan_Gambar.docx
+++ b/Jurnal_Lengkap_Dengan_Gambar.docx
@@ -27,7 +27,45 @@
           <w:sz w:val="22"/>
           <w:szCs w:val="22"/>
         </w:rPr>
-        <w:t xml:space="preserve">Muh Hafiizh Fachrezi Sofyan1, Hamria2, Muhammad Ismail3</w:t>
+        <w:t xml:space="preserve">Muh Hafiizh Fachrezi Sofyan</w:t>
+      </w:r>
+      <w:r>
+        <w:rPr>
+          <w:sz w:val="22"/>
+          <w:szCs w:val="22"/>
+          <w:vertAlign w:val="superscript"/>
+        </w:rPr>
+        <w:t xml:space="preserve">1</w:t>
+      </w:r>
+      <w:r>
+        <w:rPr>
+          <w:sz w:val="22"/>
+          <w:szCs w:val="22"/>
+        </w:rPr>
+        <w:t xml:space="preserve">, Hamria</w:t>
+      </w:r>
+      <w:r>
+        <w:rPr>
+          <w:sz w:val="22"/>
+          <w:szCs w:val="22"/>
+          <w:vertAlign w:val="superscript"/>
+        </w:rPr>
+        <w:t xml:space="preserve">2</w:t>
+      </w:r>
+      <w:r>
+        <w:rPr>
+          <w:sz w:val="22"/>
+          <w:szCs w:val="22"/>
+        </w:rPr>
+        <w:t xml:space="preserve">, Muhammad Ismail</w:t>
+      </w:r>
+      <w:r>
+        <w:rPr>
+          <w:sz w:val="22"/>
+          <w:szCs w:val="22"/>
+          <w:vertAlign w:val="superscript"/>
+        </w:rPr>
+        <w:t xml:space="preserve">3</w:t>
       </w:r>
     </w:p>
     <w:p>
@@ -45,7 +83,16 @@
         <w:jc w:val="center"/>
       </w:pPr>
       <w:r>
-        <w:t xml:space="preserve">e-mail: 1hafiizhfahrezi12@gmail.com</w:t>
+        <w:t xml:space="preserve">e-mail: </w:t>
+      </w:r>
+      <w:r>
+        <w:rPr>
+          <w:vertAlign w:val="superscript"/>
+        </w:rPr>
+        <w:t xml:space="preserve">1</w:t>
+      </w:r>
+      <w:r>
+        <w:t xml:space="preserve">hafiizhfahrezi12@gmail.com</w:t>
       </w:r>
     </w:p>
     <w:p>
@@ -270,7 +317,7 @@
           <w:b/>
           <w:bCs/>
         </w:rPr>
-        <w:t xml:space="preserve">ANALISIS DAN DESAIN SISTEM</w:t>
+        <w:t xml:space="preserve">HASIL DAN PEMBAHASAN</w:t>
       </w:r>
     </w:p>
     <w:p>

</xml_diff>